<commit_message>
Informe: anota conexion persistente/tamano percibido, log HTTPS y capturas recortadas legibles; README: como se demuestra AMQP y zona horaria
</commit_message>
<xml_diff>
--- a/Informe_Laboratorio4.docx
+++ b/Informe_Laboratorio4.docx
@@ -644,7 +644,7 @@
                 <w:i w:val="0"/>
                 <w:sz w:val="15"/>
               </w:rPr>
-              <w:t>Visible en Central:</w:t>
+              <w:t>Anotado (lo que pide el lab):</w:t>
             </w:r>
             <w:r>
               <w:rPr>
@@ -652,7 +652,39 @@
                 <w:i w:val="0"/>
                 <w:sz w:val="15"/>
               </w:rPr>
-              <w:t xml:space="preserve"> Datos sin procesar con las 3 variables (Fig. 2), dashboard (Fig. 3) y Explorador de datos (Fig. 5); dispositivo </w:t>
+              <w:t xml:space="preserve"> puerto </w:t>
+            </w:r>
+            <w:r>
+              <w:rPr>
+                <w:b/>
+                <w:i w:val="0"/>
+                <w:sz w:val="15"/>
+              </w:rPr>
+              <w:t>5671</w:t>
+            </w:r>
+            <w:r>
+              <w:rPr>
+                <w:b w:val="0"/>
+                <w:i w:val="0"/>
+                <w:sz w:val="15"/>
+              </w:rPr>
+              <w:t xml:space="preserve"> con TLS verificado; </w:t>
+            </w:r>
+            <w:r>
+              <w:rPr>
+                <w:b/>
+                <w:i w:val="0"/>
+                <w:sz w:val="15"/>
+              </w:rPr>
+              <w:t>sí aparece</w:t>
+            </w:r>
+            <w:r>
+              <w:rPr>
+                <w:b w:val="0"/>
+                <w:i w:val="0"/>
+                <w:sz w:val="15"/>
+              </w:rPr>
+              <w:t xml:space="preserve"> en datos sin procesar (Fig. 2), dashboard (Fig. 3) y Explorador de datos (Fig. 5), dispositivo </w:t>
             </w:r>
             <w:r>
               <w:rPr>
@@ -668,21 +700,7 @@
                 <w:i w:val="0"/>
                 <w:sz w:val="15"/>
               </w:rPr>
-              <w:t>.</w:t>
-            </w:r>
-          </w:p>
-          <w:p>
-            <w:pPr>
-              <w:spacing w:before="0" w:after="10"/>
-              <w:ind w:left="170" w:hanging="170"/>
-            </w:pPr>
-            <w:r>
-              <w:rPr>
-                <w:b w:val="0"/>
-                <w:i w:val="0"/>
-                <w:sz w:val="15"/>
-              </w:rPr>
-              <w:t xml:space="preserve">• </w:t>
+              <w:t xml:space="preserve">. </w:t>
             </w:r>
             <w:r>
               <w:rPr>
@@ -698,7 +716,56 @@
                 <w:i w:val="0"/>
                 <w:sz w:val="15"/>
               </w:rPr>
-              <w:t xml:space="preserve"> sesión y enlaces; ack por mensaje; </w:t>
+              <w:t xml:space="preserve"> conexión persistente en ambos, pero AMQP añade </w:t>
+            </w:r>
+            <w:r>
+              <w:rPr>
+                <w:b/>
+                <w:i w:val="0"/>
+                <w:sz w:val="15"/>
+              </w:rPr>
+              <w:t>sesión + 3 enlaces</w:t>
+            </w:r>
+            <w:r>
+              <w:rPr>
+                <w:b w:val="0"/>
+                <w:i w:val="0"/>
+                <w:sz w:val="15"/>
+              </w:rPr>
+              <w:t xml:space="preserve"> (</w:t>
+            </w:r>
+            <w:r>
+              <w:rPr>
+                <w:rFonts w:ascii="Consolas" w:hAnsi="Consolas" w:eastAsia="Consolas"/>
+                <w:b w:val="0"/>
+                <w:i w:val="0"/>
+                <w:sz w:val="13"/>
+              </w:rPr>
+              <w:t>$cbs</w:t>
+            </w:r>
+            <w:r>
+              <w:rPr>
+                <w:b w:val="0"/>
+                <w:i w:val="0"/>
+                <w:sz w:val="15"/>
+              </w:rPr>
+              <w:t xml:space="preserve"> ×2 y telemetría); tamaño percibido </w:t>
+            </w:r>
+            <w:r>
+              <w:rPr>
+                <w:b/>
+                <w:i w:val="0"/>
+                <w:sz w:val="15"/>
+              </w:rPr>
+              <w:t>438 B vs 365 B</w:t>
+            </w:r>
+            <w:r>
+              <w:rPr>
+                <w:b w:val="0"/>
+                <w:i w:val="0"/>
+                <w:sz w:val="15"/>
+              </w:rPr>
+              <w:t xml:space="preserve"> por mensaje (+20 %); ack por mensaje; </w:t>
             </w:r>
             <w:r>
               <w:rPr>
@@ -730,7 +797,7 @@
                 <w:i w:val="0"/>
                 <w:sz w:val="15"/>
               </w:rPr>
-              <w:t>); más tramas que depurar (</w:t>
+              <w:t>); debug por tramas (</w:t>
             </w:r>
             <w:r>
               <w:rPr>
@@ -1098,7 +1165,40 @@
           <w:i w:val="0"/>
           <w:sz w:val="17"/>
         </w:rPr>
-        <w:t xml:space="preserve"> ≈ 3,8 s); ambos llegan a Central (Fig. 7).</w:t>
+        <w:t xml:space="preserve"> ≈ 3,8 s); ambos llegan a Central (Fig. 8). </w:t>
+      </w:r>
+      <w:r>
+        <w:rPr>
+          <w:b/>
+          <w:i w:val="0"/>
+          <w:sz w:val="17"/>
+        </w:rPr>
+        <w:t>Checkpoint (log + captura):</w:t>
+      </w:r>
+      <w:r>
+        <w:rPr>
+          <w:b w:val="0"/>
+          <w:i w:val="0"/>
+          <w:sz w:val="17"/>
+        </w:rPr>
+        <w:t xml:space="preserve"> log del cliente en la VM con </w:t>
+      </w:r>
+      <w:r>
+        <w:rPr>
+          <w:rFonts w:ascii="Consolas" w:hAnsi="Consolas" w:eastAsia="Consolas"/>
+          <w:b w:val="0"/>
+          <w:i w:val="0"/>
+          <w:sz w:val="15"/>
+        </w:rPr>
+        <w:t>204</w:t>
+      </w:r>
+      <w:r>
+        <w:rPr>
+          <w:b w:val="0"/>
+          <w:i w:val="0"/>
+          <w:sz w:val="17"/>
+        </w:rPr>
+        <w:t xml:space="preserve"> en cada envío (Fig. 7) y la telemetría en Central (Fig. 4).</w:t>
       </w:r>
     </w:p>
     <w:tbl>
@@ -3031,7 +3131,75 @@
           <w:i w:val="0"/>
           <w:sz w:val="15"/>
         </w:rPr>
-        <w:t xml:space="preserve"> cortó la conexión, pero no debe confiarse en eso.</w:t>
+        <w:t xml:space="preserve"> cortó la conexión, pero no debe confiarse en eso. Evidencia de las mediciones: </w:t>
+      </w:r>
+      <w:r>
+        <w:rPr>
+          <w:rFonts w:ascii="Consolas" w:hAnsi="Consolas" w:eastAsia="Consolas"/>
+          <w:b w:val="0"/>
+          <w:i w:val="0"/>
+          <w:sz w:val="13"/>
+        </w:rPr>
+        <w:t>evidencias/05</w:t>
+      </w:r>
+      <w:r>
+        <w:rPr>
+          <w:b w:val="0"/>
+          <w:i w:val="0"/>
+          <w:sz w:val="15"/>
+        </w:rPr>
+        <w:t xml:space="preserve"> (bytes y latencia), </w:t>
+      </w:r>
+      <w:r>
+        <w:rPr>
+          <w:rFonts w:ascii="Consolas" w:hAnsi="Consolas" w:eastAsia="Consolas"/>
+          <w:b w:val="0"/>
+          <w:i w:val="0"/>
+          <w:sz w:val="13"/>
+        </w:rPr>
+        <w:t>06</w:t>
+      </w:r>
+      <w:r>
+        <w:rPr>
+          <w:b w:val="0"/>
+          <w:i w:val="0"/>
+          <w:sz w:val="15"/>
+        </w:rPr>
+        <w:t xml:space="preserve"> (corte de red), </w:t>
+      </w:r>
+      <w:r>
+        <w:rPr>
+          <w:rFonts w:ascii="Consolas" w:hAnsi="Consolas" w:eastAsia="Consolas"/>
+          <w:b w:val="0"/>
+          <w:i w:val="0"/>
+          <w:sz w:val="13"/>
+        </w:rPr>
+        <w:t>07</w:t>
+      </w:r>
+      <w:r>
+        <w:rPr>
+          <w:b w:val="0"/>
+          <w:i w:val="0"/>
+          <w:sz w:val="15"/>
+        </w:rPr>
+        <w:t xml:space="preserve"> (renovación del SAS) y los CSV/logs de </w:t>
+      </w:r>
+      <w:r>
+        <w:rPr>
+          <w:rFonts w:ascii="Consolas" w:hAnsi="Consolas" w:eastAsia="Consolas"/>
+          <w:b w:val="0"/>
+          <w:i w:val="0"/>
+          <w:sz w:val="13"/>
+        </w:rPr>
+        <w:t>mediciones/</w:t>
+      </w:r>
+      <w:r>
+        <w:rPr>
+          <w:b w:val="0"/>
+          <w:i w:val="0"/>
+          <w:sz w:val="15"/>
+        </w:rPr>
+        <w:t>.</w:t>
       </w:r>
     </w:p>
     <w:p>
@@ -3299,7 +3467,7 @@
             <w:r>
               <w:drawing>
                 <wp:inline xmlns:a="http://schemas.openxmlformats.org/drawingml/2006/main" xmlns:pic="http://schemas.openxmlformats.org/drawingml/2006/picture">
-                  <wp:extent cx="3240000" cy="1442296"/>
+                  <wp:extent cx="3240000" cy="1552186"/>
                   <wp:docPr id="2" name="Picture 2"/>
                   <wp:cNvGraphicFramePr>
                     <a:graphicFrameLocks noChangeAspect="1"/>
@@ -3308,7 +3476,7 @@
                     <a:graphicData uri="http://schemas.openxmlformats.org/drawingml/2006/picture">
                       <pic:pic>
                         <pic:nvPicPr>
-                          <pic:cNvPr id="0" name="12-central-amqp-datos-sin-procesar.jpg"/>
+                          <pic:cNvPr id="0" name="12-central-amqp-datos-sin-procesar_recorte.png"/>
                           <pic:cNvPicPr/>
                         </pic:nvPicPr>
                         <pic:blipFill>
@@ -3320,7 +3488,7 @@
                         <pic:spPr>
                           <a:xfrm>
                             <a:off x="0" y="0"/>
-                            <a:ext cx="3240000" cy="1442296"/>
+                            <a:ext cx="3240000" cy="1552186"/>
                           </a:xfrm>
                           <a:prstGeom prst="rect"/>
                         </pic:spPr>
@@ -3365,7 +3533,7 @@
             <w:r>
               <w:drawing>
                 <wp:inline xmlns:a="http://schemas.openxmlformats.org/drawingml/2006/main" xmlns:pic="http://schemas.openxmlformats.org/drawingml/2006/picture">
-                  <wp:extent cx="3240000" cy="1442296"/>
+                  <wp:extent cx="3240000" cy="1409219"/>
                   <wp:docPr id="3" name="Picture 3"/>
                   <wp:cNvGraphicFramePr>
                     <a:graphicFrameLocks noChangeAspect="1"/>
@@ -3374,7 +3542,7 @@
                     <a:graphicData uri="http://schemas.openxmlformats.org/drawingml/2006/picture">
                       <pic:pic>
                         <pic:nvPicPr>
-                          <pic:cNvPr id="0" name="16-central-dashboard-3-protocolos.jpg"/>
+                          <pic:cNvPr id="0" name="16-central-dashboard-3-protocolos_recorte.png"/>
                           <pic:cNvPicPr/>
                         </pic:nvPicPr>
                         <pic:blipFill>
@@ -3386,7 +3554,7 @@
                         <pic:spPr>
                           <a:xfrm>
                             <a:off x="0" y="0"/>
-                            <a:ext cx="3240000" cy="1442296"/>
+                            <a:ext cx="3240000" cy="1409219"/>
                           </a:xfrm>
                           <a:prstGeom prst="rect"/>
                         </pic:spPr>
@@ -3433,7 +3601,7 @@
             <w:r>
               <w:drawing>
                 <wp:inline xmlns:a="http://schemas.openxmlformats.org/drawingml/2006/main" xmlns:pic="http://schemas.openxmlformats.org/drawingml/2006/picture">
-                  <wp:extent cx="3240000" cy="1440230"/>
+                  <wp:extent cx="3240000" cy="1552186"/>
                   <wp:docPr id="4" name="Picture 4"/>
                   <wp:cNvGraphicFramePr>
                     <a:graphicFrameLocks noChangeAspect="1"/>
@@ -3442,7 +3610,7 @@
                     <a:graphicData uri="http://schemas.openxmlformats.org/drawingml/2006/picture">
                       <pic:pic>
                         <pic:nvPicPr>
-                          <pic:cNvPr id="0" name="13-central-https-datos-sin-procesar.jpg"/>
+                          <pic:cNvPr id="0" name="13-central-https-datos-sin-procesar_recorte.png"/>
                           <pic:cNvPicPr/>
                         </pic:nvPicPr>
                         <pic:blipFill>
@@ -3454,7 +3622,7 @@
                         <pic:spPr>
                           <a:xfrm>
                             <a:off x="0" y="0"/>
-                            <a:ext cx="3240000" cy="1440230"/>
+                            <a:ext cx="3240000" cy="1552186"/>
                           </a:xfrm>
                           <a:prstGeom prst="rect"/>
                         </pic:spPr>
@@ -3499,7 +3667,7 @@
             <w:r>
               <w:drawing>
                 <wp:inline xmlns:a="http://schemas.openxmlformats.org/drawingml/2006/main" xmlns:pic="http://schemas.openxmlformats.org/drawingml/2006/picture">
-                  <wp:extent cx="3240000" cy="1442296"/>
+                  <wp:extent cx="3240000" cy="1422973"/>
                   <wp:docPr id="5" name="Picture 5"/>
                   <wp:cNvGraphicFramePr>
                     <a:graphicFrameLocks noChangeAspect="1"/>
@@ -3508,7 +3676,7 @@
                     <a:graphicData uri="http://schemas.openxmlformats.org/drawingml/2006/picture">
                       <pic:pic>
                         <pic:nvPicPr>
-                          <pic:cNvPr id="0" name="18-central-explorador-datos.jpg"/>
+                          <pic:cNvPr id="0" name="18-central-explorador-datos_recorte.png"/>
                           <pic:cNvPicPr/>
                         </pic:nvPicPr>
                         <pic:blipFill>
@@ -3520,7 +3688,7 @@
                         <pic:spPr>
                           <a:xfrm>
                             <a:off x="0" y="0"/>
-                            <a:ext cx="3240000" cy="1442296"/>
+                            <a:ext cx="3240000" cy="1422973"/>
                           </a:xfrm>
                           <a:prstGeom prst="rect"/>
                         </pic:spPr>
@@ -3564,13 +3732,14 @@
         </w:tblBorders>
       </w:tblPr>
       <w:tblGrid>
-        <w:gridCol w:w="5273"/>
-        <w:gridCol w:w="5273"/>
+        <w:gridCol w:w="3515"/>
+        <w:gridCol w:w="3515"/>
+        <w:gridCol w:w="3515"/>
       </w:tblGrid>
       <w:tr>
         <w:tc>
           <w:tcPr>
-            <w:tcW w:type="dxa" w:w="5272"/>
+            <w:tcW w:type="dxa" w:w="3515"/>
             <w:tcMar>
               <w:top w:w="10" w:type="dxa"/>
               <w:left w:w="15" w:type="dxa"/>
@@ -3586,7 +3755,7 @@
             <w:r>
               <w:drawing>
                 <wp:inline xmlns:a="http://schemas.openxmlformats.org/drawingml/2006/main" xmlns:pic="http://schemas.openxmlformats.org/drawingml/2006/picture">
-                  <wp:extent cx="3240000" cy="2075000"/>
+                  <wp:extent cx="2124000" cy="1360278"/>
                   <wp:docPr id="6" name="Picture 6"/>
                   <wp:cNvGraphicFramePr>
                     <a:graphicFrameLocks noChangeAspect="1"/>
@@ -3607,7 +3776,7 @@
                         <pic:spPr>
                           <a:xfrm>
                             <a:off x="0" y="0"/>
-                            <a:ext cx="3240000" cy="2075000"/>
+                            <a:ext cx="2124000" cy="1360278"/>
                           </a:xfrm>
                           <a:prstGeom prst="rect"/>
                         </pic:spPr>
@@ -3628,15 +3797,15 @@
                 <w:b w:val="0"/>
                 <w:i/>
                 <w:color w:val="555B66"/>
-                <w:sz w:val="14"/>
+                <w:sz w:val="13"/>
               </w:rPr>
-              <w:t>Fig. 6 — Tramas AMQP reales (PN_TRACE_FRM): SASL, open, begin, attach $cbs, flow (crédito 50), transfer put-token → disposition accepted y attach del enlace de telemetría (sesión completa: evidencias/02b).</w:t>
+              <w:t>Fig. 6 — Tramas AMQP reales (PN_TRACE_FRM): SASL, open, begin, attach $cbs, flow (crédito 50), put-token → accepted, attach de telemetría (completo: evidencias/02b).</w:t>
             </w:r>
           </w:p>
         </w:tc>
         <w:tc>
           <w:tcPr>
-            <w:tcW w:type="dxa" w:w="5272"/>
+            <w:tcW w:type="dxa" w:w="3515"/>
             <w:tcMar>
               <w:top w:w="10" w:type="dxa"/>
               <w:left w:w="15" w:type="dxa"/>
@@ -3652,7 +3821,7 @@
             <w:r>
               <w:drawing>
                 <wp:inline xmlns:a="http://schemas.openxmlformats.org/drawingml/2006/main" xmlns:pic="http://schemas.openxmlformats.org/drawingml/2006/picture">
-                  <wp:extent cx="3240000" cy="1440230"/>
+                  <wp:extent cx="2124000" cy="734222"/>
                   <wp:docPr id="7" name="Picture 7"/>
                   <wp:cNvGraphicFramePr>
                     <a:graphicFrameLocks noChangeAspect="1"/>
@@ -3661,7 +3830,7 @@
                     <a:graphicData uri="http://schemas.openxmlformats.org/drawingml/2006/picture">
                       <pic:pic>
                         <pic:nvPicPr>
-                          <pic:cNvPr id="0" name="15-central-esp32-datos-sin-procesar.jpg"/>
+                          <pic:cNvPr id="0" name="03-https-vm-log.png"/>
                           <pic:cNvPicPr/>
                         </pic:nvPicPr>
                         <pic:blipFill>
@@ -3673,7 +3842,7 @@
                         <pic:spPr>
                           <a:xfrm>
                             <a:off x="0" y="0"/>
-                            <a:ext cx="3240000" cy="1440230"/>
+                            <a:ext cx="2124000" cy="734222"/>
                           </a:xfrm>
                           <a:prstGeom prst="rect"/>
                         </pic:spPr>
@@ -3694,14 +3863,94 @@
                 <w:b w:val="0"/>
                 <w:i/>
                 <w:color w:val="555B66"/>
-                <w:sz w:val="14"/>
+                <w:sz w:val="13"/>
               </w:rPr>
-              <w:t>Fig. 7 — ESP32 en Wokwi: telemetría por HTTPS (sin eventos de conexión) y por MQTT (Dispositivo conectado/desconectado).</w:t>
+              <w:t>Fig. 7 — Log del cliente HTTPS en la VM: DPS por REST, POST y HTTP 204 por cada lectura (curl: evidencias/11).</w:t>
+            </w:r>
+          </w:p>
+        </w:tc>
+        <w:tc>
+          <w:tcPr>
+            <w:tcW w:type="dxa" w:w="3515"/>
+            <w:tcMar>
+              <w:top w:w="10" w:type="dxa"/>
+              <w:left w:w="15" w:type="dxa"/>
+              <w:bottom w:w="10" w:type="dxa"/>
+              <w:right w:w="15" w:type="dxa"/>
+            </w:tcMar>
+          </w:tcPr>
+          <w:p>
+            <w:pPr>
+              <w:spacing w:after="0"/>
+              <w:jc w:val="center"/>
+            </w:pPr>
+            <w:r>
+              <w:drawing>
+                <wp:inline xmlns:a="http://schemas.openxmlformats.org/drawingml/2006/main" xmlns:pic="http://schemas.openxmlformats.org/drawingml/2006/picture">
+                  <wp:extent cx="2124000" cy="1536195"/>
+                  <wp:docPr id="8" name="Picture 8"/>
+                  <wp:cNvGraphicFramePr>
+                    <a:graphicFrameLocks noChangeAspect="1"/>
+                  </wp:cNvGraphicFramePr>
+                  <a:graphic>
+                    <a:graphicData uri="http://schemas.openxmlformats.org/drawingml/2006/picture">
+                      <pic:pic>
+                        <pic:nvPicPr>
+                          <pic:cNvPr id="0" name="15-central-esp32-datos-sin-procesar_recorte.png"/>
+                          <pic:cNvPicPr/>
+                        </pic:nvPicPr>
+                        <pic:blipFill>
+                          <a:blip r:embed="rId16"/>
+                          <a:stretch>
+                            <a:fillRect/>
+                          </a:stretch>
+                        </pic:blipFill>
+                        <pic:spPr>
+                          <a:xfrm>
+                            <a:off x="0" y="0"/>
+                            <a:ext cx="2124000" cy="1536195"/>
+                          </a:xfrm>
+                          <a:prstGeom prst="rect"/>
+                        </pic:spPr>
+                      </pic:pic>
+                    </a:graphicData>
+                  </a:graphic>
+                </wp:inline>
+              </w:drawing>
+            </w:r>
+          </w:p>
+          <w:p>
+            <w:pPr>
+              <w:spacing w:after="0"/>
+              <w:jc w:val="center"/>
+            </w:pPr>
+            <w:r>
+              <w:rPr>
+                <w:b w:val="0"/>
+                <w:i/>
+                <w:color w:val="555B66"/>
+                <w:sz w:val="13"/>
+              </w:rPr>
+              <w:t>Fig. 8 — ESP32 en Wokwi en Central: HTTPS (sin eventos de conexión) y MQTT (conectado/desconectado).</w:t>
             </w:r>
           </w:p>
         </w:tc>
       </w:tr>
     </w:tbl>
+    <w:p>
+      <w:pPr>
+        <w:spacing w:before="0" w:after="20"/>
+      </w:pPr>
+      <w:r>
+        <w:rPr>
+          <w:b w:val="0"/>
+          <w:i/>
+          <w:color w:val="555B66"/>
+          <w:sz w:val="13"/>
+        </w:rPr>
+        <w:t>Las capturas de Central muestran hora de Bogotá (UTC−5); los logs de la VM, UTC (p. ej. 0:15 en Central = 05:15 en el log).</w:t>
+      </w:r>
+    </w:p>
     <w:p>
       <w:pPr>
         <w:spacing w:before="60" w:after="20"/>
@@ -4808,7 +5057,7 @@
                 <w:i w:val="0"/>
                 <w:sz w:val="14"/>
               </w:rPr>
-              <w:t xml:space="preserve">Sí† · </w:t>
+              <w:t xml:space="preserve">Comandos: sí† · estado: </w:t>
             </w:r>
             <w:r>
               <w:rPr>
@@ -4850,7 +5099,7 @@
                 <w:i w:val="0"/>
                 <w:sz w:val="14"/>
               </w:rPr>
-              <w:t xml:space="preserve">No† · </w:t>
+              <w:t xml:space="preserve">Comandos: no† · estado: </w:t>
             </w:r>
             <w:r>
               <w:rPr>

</xml_diff>

<commit_message>
Informe y README: agrega integrantes
</commit_message>
<xml_diff>
--- a/Informe_Laboratorio4.docx
+++ b/Informe_Laboratorio4.docx
@@ -18,7 +18,7 @@
     </w:p>
     <w:p>
       <w:pPr>
-        <w:spacing w:before="0" w:after="40"/>
+        <w:spacing w:before="0" w:after="0"/>
       </w:pPr>
       <w:r>
         <w:rPr>
@@ -28,6 +28,19 @@
           <w:sz w:val="15"/>
         </w:rPr>
         <w:t>IoT + Cloud + Sistemas Distribuidos · UNAB · Escenario UNAB-Ambiental · App IoT Central: lab4-medidordeclima-unab · Repositorio: https://github.com/Daniverd15/Laboratorio-4</w:t>
+      </w:r>
+    </w:p>
+    <w:p>
+      <w:pPr>
+        <w:spacing w:before="0" w:after="40"/>
+      </w:pPr>
+      <w:r>
+        <w:rPr>
+          <w:b/>
+          <w:i w:val="0"/>
+          <w:sz w:val="17"/>
+        </w:rPr>
+        <w:t>Integrantes: Daniel Villamizar · Tomás Urieles · David Guerrero</w:t>
       </w:r>
     </w:p>
     <w:p>

</xml_diff>